<commit_message>
fix: simplify combat projectiles and prevent destroyed tower resurrection
</commit_message>
<xml_diff>
--- a/docs/CURRENT_GAME_DESIGN.docx
+++ b/docs/CURRENT_GAME_DESIGN.docx
@@ -16,7 +16,7 @@
     </w:p>
     <w:p>
       <w:r>
-        <w:t>更新日期：2026-09-06</w:t>
+        <w:t>更新日期：2026-09-25</w:t>
       </w:r>
     </w:p>
     <w:p>
@@ -25474,6 +25474,63 @@
       </w:pPr>
       <w:r>
         <w:t>1V1/2V2 保持镜像，3V3 与自由混战保持六重旋转；额外金矿不能落在基地相邻圈，因此开局不能直接解锁两座金矿。</w:t>
+      </w:r>
+    </w:p>
+    <w:p>
+      <w:pPr>
+        <w:pStyle w:val="Heading1"/>
+        <w:spacing w:after="80" w:before="160" w:line="276" w:lineRule="auto"/>
+      </w:pPr>
+      <w:r>
+        <w:t>17. 2026-09-25 弹体表现与建筑状态修订</w:t>
+      </w:r>
+    </w:p>
+    <w:p>
+      <w:r>
+        <w:rPr>
+          <w:rFonts w:ascii="Microsoft YaHei" w:hAnsi="Microsoft YaHei" w:eastAsia="Microsoft YaHei"/>
+        </w:rPr>
+        <w:t>本轮按制作人要求取消子弹拖尾、改为自然弹体，修正空血防御塔状态，并为刺猬技能增加对建筑无效限制。以下规则覆盖同类旧描述；其余战斗属性、范围、攻击时序与既有布局不变，运行时完成状态以本轮验收证据为准。</w:t>
+      </w:r>
+    </w:p>
+    <w:p>
+      <w:r>
+        <w:rPr>
+          <w:rFonts w:ascii="Microsoft YaHei" w:hAnsi="Microsoft YaHei" w:eastAsia="Microsoft YaHei"/>
+        </w:rPr>
+        <w:t>取消路径拖尾和夸张的十字命中闪光。弹体使用小体积、低饱和且有实物轮廓的种子、水滴、羽毛、小石块、弩箭、铁弹与坚果七类造型；飞行中保持实体轮廓，终点仅保留弹体自身 0.08 秒收缩淡出。发射、飞行与终点均须可见，不改变伤害时机或弹速。</w:t>
+      </w:r>
+    </w:p>
+    <w:p>
+      <w:r>
+        <w:rPr>
+          <w:rFonts w:ascii="Microsoft YaHei" w:hAnsi="Microsoft YaHei" w:eastAsia="Microsoft YaHei"/>
+        </w:rPr>
+        <w:t>动物弹体：麻雀用种子；青蛙、鸭子、天鹅用水滴；鹦鹉、鹤及猛禽用羽毛；狐狸及其他未单独定义的来源用小石块。防御塔弹体：兔子哨塔和麻雀速弩塔用轻弩箭，猎鹰瞭望塔和金雕领空塔用长弩箭，野猪重弩塔和老虎赏金塔用铁弹，松鼠掠金塔用坚果，龟甲壁垒塔用较重石块，鹦鹉双弩塔用双羽弹；基地用小石块。猛犸震地塔保留全体脉冲。仅替换表现，不改变攻击或额外目标机制。</w:t>
+      </w:r>
+    </w:p>
+    <w:p>
+      <w:r>
+        <w:rPr>
+          <w:rFonts w:ascii="Microsoft YaHei" w:hAnsi="Microsoft YaHei" w:eastAsia="Microsoft YaHei"/>
+        </w:rPr>
+        <w:t>建筑在同帧伤害或反应结算中被摧毁后，后续攻击、冷却或周期更新不得用旧地块副本恢复它。真正归零的建筑必须进入既有摧毁和占领流程；不能只隐藏血条。受伤且生命大于 0 的建筑即使剩余比例极低，生命填充仍至少保留 3 个逻辑像素；满血隐藏、阵营编号与其他进度条规则不变。</w:t>
+      </w:r>
+    </w:p>
+    <w:p>
+      <w:r>
+        <w:rPr>
+          <w:rFonts w:ascii="Microsoft YaHei" w:hAnsi="Microsoft YaHei" w:eastAsia="Microsoft YaHei"/>
+        </w:rPr>
+        <w:t>刺猬技能正式描述：受到伤害时，对伤害来源造成1点伤害；对建筑无效。以 config/tables/cards.csv::hedgehog.skill_text 为源并导出 runtime/config/cards.json；沿用动物表 V3 的实际生命伤害触发，包含近战与远程来源，反伤不递归，保留既有致死处理和护盾完全吸收不触发的边界。伤害来源为基地、防御塔或其他建筑时，该技能不造成反伤；刺猬对建筑的普通攻击照常。本条取代历史“仅近战、3 点反伤”口径。</w:t>
+      </w:r>
+    </w:p>
+    <w:p>
+      <w:r>
+        <w:rPr>
+          <w:rFonts w:ascii="Microsoft YaHei" w:hAnsi="Microsoft YaHei" w:eastAsia="Microsoft YaHei"/>
+        </w:rPr>
+        <w:t>验收覆盖七类弹体、不同动物与塔的映射、终点短暂收缩、低血建筑可见填充、同帧建筑销毁后不复原，以及刺猬对近战动物、远程动物和建筑来源的区别；复核普通攻击建筑、护盾完全吸收、既有致死边界与其余战斗数值不变。本节为本轮正式规则修订，不等同于运行时通过。</w:t>
       </w:r>
     </w:p>
     <w:sectPr>

</xml_diff>